<commit_message>
add: UML/DFD diagrams rendered and inserted into thesis
- Final-Final/diagrams/: PlantUML sources (.puml) for 5 diagrams
  - usecase.puml, sequence-login.puml, sequence-oauth.puml
  - dfd-level0.puml, dfd-level1.puml
- Final-Final/diagrams/output/*.png: rendered PNGs via PlantUML API
- Final-Final/diagrams/render_diagrams.py: renders .puml → PNG
- Final-Final/insert_diagrams.py: inserts PNGs into TAS6-final.docx
- TAS6-final.docx: updated with all 5 diagrams in §3.3–3.5
  - รูปที่ 3.1 Use Case Diagram (§3.3)
  - รูปที่ 3.2 ER Diagram (existing, unchanged)
  - รูปที่ 3.3–3.4 Sequence Diagrams (new §3.4)
  - รูปที่ 3.5–3.6 DFD Level 0 and Level 1 (new §3.5)

Co-Authored-By: Claude Sonnet 4.6 <noreply@anthropic.com>
</commit_message>
<xml_diff>
--- a/Final-Final/TAS6-final.docx
+++ b/Final-Final/TAS6-final.docx
@@ -14391,13 +14391,86 @@
     </w:p>
     <w:p/>
     <w:p>
+      <w:pPr>
+        <w:jc w:val="center"/>
+      </w:pPr>
+      <w:r>
+        <w:drawing>
+          <wp:inline xmlns:a="http://schemas.openxmlformats.org/drawingml/2006/main" xmlns:pic="http://schemas.openxmlformats.org/drawingml/2006/picture">
+            <wp:extent cx="5029200" cy="13254833"/>
+            <wp:docPr id="1" name="Picture 1"/>
+            <wp:cNvGraphicFramePr>
+              <a:graphicFrameLocks noChangeAspect="1"/>
+            </wp:cNvGraphicFramePr>
+            <a:graphic>
+              <a:graphicData uri="http://schemas.openxmlformats.org/drawingml/2006/picture">
+                <pic:pic>
+                  <pic:nvPicPr>
+                    <pic:cNvPr id="0" name="usecase.png"/>
+                    <pic:cNvPicPr/>
+                  </pic:nvPicPr>
+                  <pic:blipFill>
+                    <a:blip r:embed="rId8"/>
+                    <a:stretch>
+                      <a:fillRect/>
+                    </a:stretch>
+                  </pic:blipFill>
+                  <pic:spPr>
+                    <a:xfrm>
+                      <a:off x="0" y="0"/>
+                      <a:ext cx="5029200" cy="13254833"/>
+                    </a:xfrm>
+                    <a:prstGeom prst="rect"/>
+                  </pic:spPr>
+                </pic:pic>
+              </a:graphicData>
+            </a:graphic>
+          </wp:inline>
+        </w:drawing>
+      </w:r>
+    </w:p>
+    <w:p>
+      <w:pPr>
+        <w:jc w:val="center"/>
+      </w:pPr>
+      <w:r>
+        <w:rPr>
+          <w:i/>
+          <w:sz w:val="20"/>
+        </w:rPr>
+        <w:t>รูปที่ 3.1 Use Case Diagram</w:t>
+      </w:r>
+    </w:p>
+    <w:p>
+      <w:pPr>
+        <w:tabs>
+          <w:tab w:val="center" w:pos="1308"/>
+          <w:tab w:val="center" w:pos="5984"/>
+        </w:tabs>
+        <w:spacing w:after="65" w:line="259" w:lineRule="auto"/>
+        <w:ind w:left="1308" w:right="0" w:firstLine="0"/>
+        <w:rPr>
+          <w:b/>
+          <w:bCs/>
+        </w:rPr>
+      </w:pPr>
+      <w:r>
+        <w:rPr>
+          <w:b/>
+          <w:bCs/>
+        </w:rPr>
+        <w:t>3.4 ER Diagram (Entity Relationship Diagram)</w:t>
+      </w:r>
+    </w:p>
+    <w:p/>
+    <w:p>
       <w:r>
         <w:rPr>
           <w:i/>
           <w:color w:val="1F4E79"/>
           <w:sz w:val="22"/>
         </w:rPr>
-        <w:t>[ ภาพที่จะแทรก: รูปที่ 3.1 Use Case Diagram ของระบบยืนยันตัวตน (TAS) — กรุณา Insert รูปภาพในตำแหน่งนี้ ]</w:t>
+        <w:t>[ ภาพที่จะแทรก: รูปที่ 3.2 ER Diagram — ความสัมพันธ์ระหว่าง 7 entities ใน MongoDB — กรุณา Insert รูปภาพในตำแหน่งนี้ ]</w:t>
       </w:r>
     </w:p>
     <w:p>
@@ -14409,51 +14482,263 @@
           <w:i/>
           <w:sz w:val="20"/>
         </w:rPr>
-        <w:t>รูปที่ 3.1 Use Case Diagram</w:t>
-      </w:r>
-    </w:p>
-    <w:p>
-      <w:pPr>
-        <w:tabs>
-          <w:tab w:val="center" w:pos="1308"/>
-          <w:tab w:val="center" w:pos="5984"/>
-        </w:tabs>
-        <w:spacing w:after="65" w:line="259" w:lineRule="auto"/>
-        <w:ind w:left="1308" w:right="0" w:firstLine="0"/>
-        <w:rPr>
-          <w:b/>
-          <w:bCs/>
-        </w:rPr>
-      </w:pPr>
-      <w:r>
-        <w:rPr>
-          <w:b/>
-          <w:bCs/>
-        </w:rPr>
-        <w:t>3.4 ER Diagram (Entity Relationship Diagram)</w:t>
+        <w:t>รูปที่ 3.2 Entity Relationship Diagram</w:t>
       </w:r>
     </w:p>
     <w:p/>
     <w:p>
       <w:r>
         <w:rPr>
-          <w:i/>
-          <w:color w:val="1F4E79"/>
-          <w:sz w:val="22"/>
-        </w:rPr>
-        <w:t>[ ภาพที่จะแทรก: รูปที่ 3.2 ER Diagram — ความสัมพันธ์ระหว่าง 7 entities ใน MongoDB — กรุณา Insert รูปภาพในตำแหน่งนี้ ]</w:t>
-      </w:r>
-    </w:p>
+          <w:b/>
+          <w:i w:val="0"/>
+          <w:sz w:val="24"/>
+        </w:rPr>
+        <w:t>3.4 Sequence Diagrams</w:t>
+      </w:r>
+    </w:p>
+    <w:p/>
+    <w:p>
+      <w:r>
+        <w:rPr>
+          <w:b w:val="0"/>
+          <w:i w:val="0"/>
+          <w:sz w:val="24"/>
+        </w:rPr>
+        <w:t>Sequence Diagram แสดงลำดับการส่งข้อความระหว่าง components ในกระบวนการหลักสองกระบวนการ: การ Login แบบ Local และการ Authorization ด้วย OAuth 2.0 PKCE</w:t>
+      </w:r>
+    </w:p>
+    <w:p/>
     <w:p>
       <w:pPr>
         <w:jc w:val="center"/>
       </w:pPr>
       <w:r>
-        <w:rPr>
-          <w:i/>
-          <w:sz w:val="20"/>
-        </w:rPr>
-        <w:t>รูปที่ 3.2 Entity Relationship Diagram</w:t>
+        <w:drawing>
+          <wp:inline xmlns:a="http://schemas.openxmlformats.org/drawingml/2006/main" xmlns:pic="http://schemas.openxmlformats.org/drawingml/2006/picture">
+            <wp:extent cx="5029200" cy="5869802"/>
+            <wp:docPr id="2" name="Picture 2"/>
+            <wp:cNvGraphicFramePr>
+              <a:graphicFrameLocks noChangeAspect="1"/>
+            </wp:cNvGraphicFramePr>
+            <a:graphic>
+              <a:graphicData uri="http://schemas.openxmlformats.org/drawingml/2006/picture">
+                <pic:pic>
+                  <pic:nvPicPr>
+                    <pic:cNvPr id="0" name="sequence-login.png"/>
+                    <pic:cNvPicPr/>
+                  </pic:nvPicPr>
+                  <pic:blipFill>
+                    <a:blip r:embed="rId9"/>
+                    <a:stretch>
+                      <a:fillRect/>
+                    </a:stretch>
+                  </pic:blipFill>
+                  <pic:spPr>
+                    <a:xfrm>
+                      <a:off x="0" y="0"/>
+                      <a:ext cx="5029200" cy="5869802"/>
+                    </a:xfrm>
+                    <a:prstGeom prst="rect"/>
+                  </pic:spPr>
+                </pic:pic>
+              </a:graphicData>
+            </a:graphic>
+          </wp:inline>
+        </w:drawing>
+      </w:r>
+    </w:p>
+    <w:p>
+      <w:pPr>
+        <w:jc w:val="center"/>
+      </w:pPr>
+      <w:r>
+        <w:rPr>
+          <w:b w:val="0"/>
+          <w:i w:val="0"/>
+          <w:sz w:val="24"/>
+        </w:rPr>
+        <w:t>รูปที่ 3.3 Sequence Diagram: กระบวนการ Login (Local Authentication)</w:t>
+      </w:r>
+    </w:p>
+    <w:p/>
+    <w:p>
+      <w:pPr>
+        <w:jc w:val="center"/>
+      </w:pPr>
+      <w:r>
+        <w:drawing>
+          <wp:inline xmlns:a="http://schemas.openxmlformats.org/drawingml/2006/main" xmlns:pic="http://schemas.openxmlformats.org/drawingml/2006/picture">
+            <wp:extent cx="5029200" cy="11023655"/>
+            <wp:docPr id="3" name="Picture 3"/>
+            <wp:cNvGraphicFramePr>
+              <a:graphicFrameLocks noChangeAspect="1"/>
+            </wp:cNvGraphicFramePr>
+            <a:graphic>
+              <a:graphicData uri="http://schemas.openxmlformats.org/drawingml/2006/picture">
+                <pic:pic>
+                  <pic:nvPicPr>
+                    <pic:cNvPr id="0" name="sequence-oauth.png"/>
+                    <pic:cNvPicPr/>
+                  </pic:nvPicPr>
+                  <pic:blipFill>
+                    <a:blip r:embed="rId10"/>
+                    <a:stretch>
+                      <a:fillRect/>
+                    </a:stretch>
+                  </pic:blipFill>
+                  <pic:spPr>
+                    <a:xfrm>
+                      <a:off x="0" y="0"/>
+                      <a:ext cx="5029200" cy="11023655"/>
+                    </a:xfrm>
+                    <a:prstGeom prst="rect"/>
+                  </pic:spPr>
+                </pic:pic>
+              </a:graphicData>
+            </a:graphic>
+          </wp:inline>
+        </w:drawing>
+      </w:r>
+    </w:p>
+    <w:p>
+      <w:pPr>
+        <w:jc w:val="center"/>
+      </w:pPr>
+      <w:r>
+        <w:rPr>
+          <w:b w:val="0"/>
+          <w:i w:val="0"/>
+          <w:sz w:val="24"/>
+        </w:rPr>
+        <w:t>รูปที่ 3.4 Sequence Diagram: OAuth 2.0 PKCE Authorization Code Flow</w:t>
+      </w:r>
+    </w:p>
+    <w:p/>
+    <w:p>
+      <w:r>
+        <w:rPr>
+          <w:b/>
+          <w:i w:val="0"/>
+          <w:sz w:val="24"/>
+        </w:rPr>
+        <w:t>3.5 Data Flow Diagrams (DFD)</w:t>
+      </w:r>
+    </w:p>
+    <w:p/>
+    <w:p>
+      <w:r>
+        <w:rPr>
+          <w:b w:val="0"/>
+          <w:i w:val="0"/>
+          <w:sz w:val="24"/>
+        </w:rPr>
+        <w:t>Data Flow Diagram แสดงการไหลของข้อมูลระหว่าง external entities และ processes ภายในระบบ Level 0 (Context Diagram) แสดงภาพรวมของระบบ และ Level 1 แสดงการแตก processes ย่อย</w:t>
+      </w:r>
+    </w:p>
+    <w:p/>
+    <w:p>
+      <w:pPr>
+        <w:jc w:val="center"/>
+      </w:pPr>
+      <w:r>
+        <w:drawing>
+          <wp:inline xmlns:a="http://schemas.openxmlformats.org/drawingml/2006/main" xmlns:pic="http://schemas.openxmlformats.org/drawingml/2006/picture">
+            <wp:extent cx="5029200" cy="1817032"/>
+            <wp:docPr id="4" name="Picture 4"/>
+            <wp:cNvGraphicFramePr>
+              <a:graphicFrameLocks noChangeAspect="1"/>
+            </wp:cNvGraphicFramePr>
+            <a:graphic>
+              <a:graphicData uri="http://schemas.openxmlformats.org/drawingml/2006/picture">
+                <pic:pic>
+                  <pic:nvPicPr>
+                    <pic:cNvPr id="0" name="dfd-level0.png"/>
+                    <pic:cNvPicPr/>
+                  </pic:nvPicPr>
+                  <pic:blipFill>
+                    <a:blip r:embed="rId11"/>
+                    <a:stretch>
+                      <a:fillRect/>
+                    </a:stretch>
+                  </pic:blipFill>
+                  <pic:spPr>
+                    <a:xfrm>
+                      <a:off x="0" y="0"/>
+                      <a:ext cx="5029200" cy="1817032"/>
+                    </a:xfrm>
+                    <a:prstGeom prst="rect"/>
+                  </pic:spPr>
+                </pic:pic>
+              </a:graphicData>
+            </a:graphic>
+          </wp:inline>
+        </w:drawing>
+      </w:r>
+    </w:p>
+    <w:p>
+      <w:pPr>
+        <w:jc w:val="center"/>
+      </w:pPr>
+      <w:r>
+        <w:rPr>
+          <w:b w:val="0"/>
+          <w:i w:val="0"/>
+          <w:sz w:val="24"/>
+        </w:rPr>
+        <w:t>รูปที่ 3.5 Data Flow Diagram Level 0 (Context Diagram)</w:t>
+      </w:r>
+    </w:p>
+    <w:p/>
+    <w:p>
+      <w:pPr>
+        <w:jc w:val="center"/>
+      </w:pPr>
+      <w:r>
+        <w:drawing>
+          <wp:inline xmlns:a="http://schemas.openxmlformats.org/drawingml/2006/main" xmlns:pic="http://schemas.openxmlformats.org/drawingml/2006/picture">
+            <wp:extent cx="5029200" cy="2328974"/>
+            <wp:docPr id="5" name="Picture 5"/>
+            <wp:cNvGraphicFramePr>
+              <a:graphicFrameLocks noChangeAspect="1"/>
+            </wp:cNvGraphicFramePr>
+            <a:graphic>
+              <a:graphicData uri="http://schemas.openxmlformats.org/drawingml/2006/picture">
+                <pic:pic>
+                  <pic:nvPicPr>
+                    <pic:cNvPr id="0" name="dfd-level1.png"/>
+                    <pic:cNvPicPr/>
+                  </pic:nvPicPr>
+                  <pic:blipFill>
+                    <a:blip r:embed="rId12"/>
+                    <a:stretch>
+                      <a:fillRect/>
+                    </a:stretch>
+                  </pic:blipFill>
+                  <pic:spPr>
+                    <a:xfrm>
+                      <a:off x="0" y="0"/>
+                      <a:ext cx="5029200" cy="2328974"/>
+                    </a:xfrm>
+                    <a:prstGeom prst="rect"/>
+                  </pic:spPr>
+                </pic:pic>
+              </a:graphicData>
+            </a:graphic>
+          </wp:inline>
+        </w:drawing>
+      </w:r>
+    </w:p>
+    <w:p>
+      <w:pPr>
+        <w:jc w:val="center"/>
+      </w:pPr>
+      <w:r>
+        <w:rPr>
+          <w:b w:val="0"/>
+          <w:i w:val="0"/>
+          <w:sz w:val="24"/>
+        </w:rPr>
+        <w:t>รูปที่ 3.6 Data Flow Diagram Level 1 (Process Decomposition)</w:t>
       </w:r>
     </w:p>
     <w:p>

</xml_diff>